<commit_message>
Dodanie Planu Testów i Raport błędów
</commit_message>
<xml_diff>
--- a/test-documentation/Plan Testów AutomationeExercise.docx
+++ b/test-documentation/Plan Testów AutomationeExercise.docx
@@ -2023,6 +2023,17 @@
         </w:numPr>
       </w:pPr>
       <w:r>
+        <w:t>środowisko</w:t>
+      </w:r>
+    </w:p>
+    <w:p>
+      <w:pPr>
+        <w:numPr>
+          <w:ilvl w:val="0"/>
+          <w:numId w:val="17"/>
+        </w:numPr>
+      </w:pPr>
+      <w:r>
         <w:t>poziom ważności (</w:t>
       </w:r>
       <w:proofErr w:type="spellStart"/>
@@ -2106,6 +2117,17 @@
       </w:pPr>
       <w:r>
         <w:t xml:space="preserve">rzeczywisty rezultat. </w:t>
+      </w:r>
+    </w:p>
+    <w:p>
+      <w:pPr>
+        <w:numPr>
+          <w:ilvl w:val="0"/>
+          <w:numId w:val="17"/>
+        </w:numPr>
+      </w:pPr>
+      <w:r>
+        <w:t>załącznik z błędem</w:t>
       </w:r>
     </w:p>
     <w:p>
@@ -2184,6 +2206,7 @@
         </w:numPr>
       </w:pPr>
       <w:r>
+        <w:lastRenderedPageBreak/>
         <w:t xml:space="preserve">implementację testów, </w:t>
       </w:r>
     </w:p>
@@ -2206,7 +2229,6 @@
         </w:numPr>
       </w:pPr>
       <w:r>
-        <w:lastRenderedPageBreak/>
         <w:t xml:space="preserve">konfigurację GitHub </w:t>
       </w:r>
       <w:proofErr w:type="spellStart"/>
@@ -5382,6 +5404,7 @@
   <w:style w:type="character" w:default="1" w:styleId="Domylnaczcionkaakapitu">
     <w:name w:val="Default Paragraph Font"/>
     <w:uiPriority w:val="1"/>
+    <w:semiHidden/>
     <w:unhideWhenUsed/>
   </w:style>
   <w:style w:type="table" w:default="1" w:styleId="Standardowy">

</xml_diff>

<commit_message>
Dodanie raportu końcowego testów oraz modyfikacja dokumentacji
</commit_message>
<xml_diff>
--- a/test-documentation/Plan Testów AutomationeExercise.docx
+++ b/test-documentation/Plan Testów AutomationeExercise.docx
@@ -4,30 +4,40 @@
   <w:body>
     <w:p>
       <w:pPr>
+        <w:jc w:val="center"/>
         <w:rPr>
           <w:b/>
           <w:bCs/>
+          <w:sz w:val="32"/>
+          <w:szCs w:val="32"/>
         </w:rPr>
       </w:pPr>
       <w:r>
         <w:rPr>
           <w:b/>
           <w:bCs/>
+          <w:sz w:val="32"/>
+          <w:szCs w:val="32"/>
         </w:rPr>
         <w:t>PLAN TESTÓW</w:t>
       </w:r>
     </w:p>
     <w:p>
       <w:pPr>
+        <w:jc w:val="center"/>
         <w:rPr>
           <w:b/>
           <w:bCs/>
+          <w:sz w:val="32"/>
+          <w:szCs w:val="32"/>
         </w:rPr>
       </w:pPr>
       <w:r>
         <w:rPr>
           <w:b/>
           <w:bCs/>
+          <w:sz w:val="32"/>
+          <w:szCs w:val="32"/>
         </w:rPr>
         <w:t xml:space="preserve">Projekt automatyzacji testów aplikacji </w:t>
       </w:r>
@@ -36,6 +46,8 @@
         <w:rPr>
           <w:b/>
           <w:bCs/>
+          <w:sz w:val="32"/>
+          <w:szCs w:val="32"/>
         </w:rPr>
         <w:t>AutomationExercise</w:t>
       </w:r>
@@ -47,12 +59,16 @@
         <w:rPr>
           <w:b/>
           <w:bCs/>
+          <w:sz w:val="32"/>
+          <w:szCs w:val="32"/>
         </w:rPr>
       </w:pPr>
       <w:r>
         <w:rPr>
           <w:b/>
           <w:bCs/>
+          <w:sz w:val="32"/>
+          <w:szCs w:val="32"/>
         </w:rPr>
         <w:t>Spis treści</w:t>
       </w:r>
@@ -287,20 +303,16 @@
         <w:rPr>
           <w:b/>
           <w:bCs/>
-        </w:rPr>
-      </w:pPr>
-    </w:p>
-    <w:p>
-      <w:pPr>
+          <w:sz w:val="32"/>
+          <w:szCs w:val="32"/>
+        </w:rPr>
+      </w:pPr>
+      <w:r>
         <w:rPr>
           <w:b/>
           <w:bCs/>
-        </w:rPr>
-      </w:pPr>
-      <w:r>
-        <w:rPr>
-          <w:b/>
-          <w:bCs/>
+          <w:sz w:val="32"/>
+          <w:szCs w:val="32"/>
         </w:rPr>
         <w:lastRenderedPageBreak/>
         <w:t>1. Wstęp</w:t>
@@ -353,12 +365,16 @@
         <w:rPr>
           <w:b/>
           <w:bCs/>
+          <w:sz w:val="32"/>
+          <w:szCs w:val="32"/>
         </w:rPr>
       </w:pPr>
       <w:r>
         <w:rPr>
           <w:b/>
           <w:bCs/>
+          <w:sz w:val="32"/>
+          <w:szCs w:val="32"/>
         </w:rPr>
         <w:t>2. Zakres testów</w:t>
       </w:r>
@@ -488,18 +504,29 @@
         <w:t>Projekt nie obejmuje testów wydajnościowych, testów bezpieczeństwa oraz testów kompatybilności mobilnej.</w:t>
       </w:r>
     </w:p>
-    <w:p/>
+    <w:p>
+      <w:pPr>
+        <w:rPr>
+          <w:sz w:val="32"/>
+          <w:szCs w:val="32"/>
+        </w:rPr>
+      </w:pPr>
+    </w:p>
     <w:p>
       <w:pPr>
         <w:rPr>
           <w:b/>
           <w:bCs/>
+          <w:sz w:val="32"/>
+          <w:szCs w:val="32"/>
         </w:rPr>
       </w:pPr>
       <w:r>
         <w:rPr>
           <w:b/>
           <w:bCs/>
+          <w:sz w:val="32"/>
+          <w:szCs w:val="32"/>
         </w:rPr>
         <w:t>3. Przedmiot testów</w:t>
       </w:r>
@@ -558,6 +585,7 @@
         </w:numPr>
       </w:pPr>
       <w:r>
+        <w:lastRenderedPageBreak/>
         <w:t xml:space="preserve">składanie zamówień, </w:t>
       </w:r>
     </w:p>
@@ -569,7 +597,6 @@
         </w:numPr>
       </w:pPr>
       <w:r>
-        <w:lastRenderedPageBreak/>
         <w:t xml:space="preserve">realizację płatności, </w:t>
       </w:r>
     </w:p>
@@ -609,12 +636,16 @@
         <w:rPr>
           <w:b/>
           <w:bCs/>
+          <w:sz w:val="32"/>
+          <w:szCs w:val="32"/>
         </w:rPr>
       </w:pPr>
       <w:r>
         <w:rPr>
           <w:b/>
           <w:bCs/>
+          <w:sz w:val="32"/>
+          <w:szCs w:val="32"/>
         </w:rPr>
         <w:t>4. Kryteria zaliczenia</w:t>
       </w:r>
@@ -710,12 +741,16 @@
         <w:rPr>
           <w:b/>
           <w:bCs/>
+          <w:sz w:val="32"/>
+          <w:szCs w:val="32"/>
         </w:rPr>
       </w:pPr>
       <w:r>
         <w:rPr>
           <w:b/>
           <w:bCs/>
+          <w:sz w:val="32"/>
+          <w:szCs w:val="32"/>
         </w:rPr>
         <w:t>5. Kryteria niezaliczenia</w:t>
       </w:r>
@@ -780,18 +815,29 @@
         <w:t xml:space="preserve">wystąpi błąd techniczny uniemożliwiający zakończenie scenariusza. </w:t>
       </w:r>
     </w:p>
-    <w:p/>
+    <w:p>
+      <w:pPr>
+        <w:rPr>
+          <w:sz w:val="32"/>
+          <w:szCs w:val="32"/>
+        </w:rPr>
+      </w:pPr>
+    </w:p>
     <w:p>
       <w:pPr>
         <w:rPr>
           <w:b/>
           <w:bCs/>
+          <w:sz w:val="32"/>
+          <w:szCs w:val="32"/>
         </w:rPr>
       </w:pPr>
       <w:r>
         <w:rPr>
           <w:b/>
           <w:bCs/>
+          <w:sz w:val="32"/>
+          <w:szCs w:val="32"/>
         </w:rPr>
         <w:t>6. Kryteria wejścia</w:t>
       </w:r>
@@ -869,6 +915,7 @@
         </w:numPr>
       </w:pPr>
       <w:r>
+        <w:lastRenderedPageBreak/>
         <w:t xml:space="preserve">zainstalowany Node.js oraz zależności </w:t>
       </w:r>
       <w:proofErr w:type="spellStart"/>
@@ -899,7 +946,6 @@
         </w:numPr>
       </w:pPr>
       <w:r>
-        <w:lastRenderedPageBreak/>
         <w:t xml:space="preserve">skonfigurowane repozytorium GitHub wraz z GitHub </w:t>
       </w:r>
       <w:proofErr w:type="spellStart"/>
@@ -928,12 +974,16 @@
         <w:rPr>
           <w:b/>
           <w:bCs/>
+          <w:sz w:val="32"/>
+          <w:szCs w:val="32"/>
         </w:rPr>
       </w:pPr>
       <w:r>
         <w:rPr>
           <w:b/>
           <w:bCs/>
+          <w:sz w:val="32"/>
+          <w:szCs w:val="32"/>
         </w:rPr>
         <w:t>7. Kryteria wyjścia</w:t>
       </w:r>
@@ -1031,12 +1081,16 @@
         <w:rPr>
           <w:b/>
           <w:bCs/>
+          <w:sz w:val="32"/>
+          <w:szCs w:val="32"/>
         </w:rPr>
       </w:pPr>
       <w:r>
         <w:rPr>
           <w:b/>
           <w:bCs/>
+          <w:sz w:val="32"/>
+          <w:szCs w:val="32"/>
         </w:rPr>
         <w:t>8. Lista funkcjonalności do przetestowania</w:t>
       </w:r>
@@ -1186,19 +1240,21 @@
         <w:t xml:space="preserve">Testy API produktów </w:t>
       </w:r>
     </w:p>
-    <w:p/>
-    <w:p/>
     <w:p>
       <w:pPr>
         <w:rPr>
           <w:b/>
           <w:bCs/>
+          <w:sz w:val="32"/>
+          <w:szCs w:val="32"/>
         </w:rPr>
       </w:pPr>
       <w:r>
         <w:rPr>
           <w:b/>
           <w:bCs/>
+          <w:sz w:val="32"/>
+          <w:szCs w:val="32"/>
         </w:rPr>
         <w:lastRenderedPageBreak/>
         <w:t>9. Środowisko testowe</w:t>
@@ -1334,18 +1390,29 @@
         <w:t>Dodatkowo testy wykonywano zarówno lokalnie, jak i w środowisku kontenerowym Linux.</w:t>
       </w:r>
     </w:p>
-    <w:p/>
+    <w:p>
+      <w:pPr>
+        <w:rPr>
+          <w:sz w:val="32"/>
+          <w:szCs w:val="32"/>
+        </w:rPr>
+      </w:pPr>
+    </w:p>
     <w:p>
       <w:pPr>
         <w:rPr>
           <w:b/>
           <w:bCs/>
+          <w:sz w:val="32"/>
+          <w:szCs w:val="32"/>
         </w:rPr>
       </w:pPr>
       <w:r>
         <w:rPr>
           <w:b/>
           <w:bCs/>
+          <w:sz w:val="32"/>
+          <w:szCs w:val="32"/>
         </w:rPr>
         <w:t>10. Kategorie błędów</w:t>
       </w:r>
@@ -1456,18 +1523,29 @@
         <w:t xml:space="preserve"> – znany błąd wykryty podczas realizacji testów. </w:t>
       </w:r>
     </w:p>
-    <w:p/>
+    <w:p>
+      <w:pPr>
+        <w:rPr>
+          <w:sz w:val="32"/>
+          <w:szCs w:val="32"/>
+        </w:rPr>
+      </w:pPr>
+    </w:p>
     <w:p>
       <w:pPr>
         <w:rPr>
           <w:b/>
           <w:bCs/>
+          <w:sz w:val="32"/>
+          <w:szCs w:val="32"/>
         </w:rPr>
       </w:pPr>
       <w:r>
         <w:rPr>
           <w:b/>
           <w:bCs/>
+          <w:sz w:val="32"/>
+          <w:szCs w:val="32"/>
         </w:rPr>
         <w:t>11. Miejsce testów</w:t>
       </w:r>
@@ -1505,29 +1583,34 @@
           <w:ilvl w:val="0"/>
           <w:numId w:val="11"/>
         </w:numPr>
-      </w:pPr>
-      <w:r>
-        <w:t xml:space="preserve">w środowisku </w:t>
+        <w:rPr>
+          <w:lang w:val="en-GB"/>
+        </w:rPr>
+      </w:pPr>
+      <w:r>
+        <w:rPr>
+          <w:lang w:val="en-GB"/>
+        </w:rPr>
+        <w:t xml:space="preserve">w </w:t>
       </w:r>
       <w:proofErr w:type="spellStart"/>
       <w:r>
-        <w:t>Continuous</w:t>
+        <w:rPr>
+          <w:lang w:val="en-GB"/>
+        </w:rPr>
+        <w:t>środowisku</w:t>
       </w:r>
       <w:proofErr w:type="spellEnd"/>
       <w:r>
-        <w:t xml:space="preserve"> Integration GitHub </w:t>
-      </w:r>
-      <w:proofErr w:type="spellStart"/>
-      <w:r>
-        <w:t>Actions</w:t>
-      </w:r>
-      <w:proofErr w:type="spellEnd"/>
-      <w:r>
-        <w:t xml:space="preserve">. </w:t>
-      </w:r>
-    </w:p>
-    <w:p>
-      <w:r>
+        <w:rPr>
+          <w:lang w:val="en-GB"/>
+        </w:rPr>
+        <w:t xml:space="preserve"> Continuous Integration GitHub Actions. </w:t>
+      </w:r>
+    </w:p>
+    <w:p>
+      <w:r>
+        <w:lastRenderedPageBreak/>
         <w:t xml:space="preserve">Pozwoliło to na sprawdzenie stabilności </w:t>
       </w:r>
       <w:proofErr w:type="spellStart"/>
@@ -1545,14 +1628,17 @@
         <w:rPr>
           <w:b/>
           <w:bCs/>
+          <w:sz w:val="32"/>
+          <w:szCs w:val="32"/>
         </w:rPr>
       </w:pPr>
       <w:r>
         <w:rPr>
           <w:b/>
           <w:bCs/>
-        </w:rPr>
-        <w:lastRenderedPageBreak/>
+          <w:sz w:val="32"/>
+          <w:szCs w:val="32"/>
+        </w:rPr>
         <w:t>12. Harmonogram testów</w:t>
       </w:r>
     </w:p>
@@ -1693,12 +1779,16 @@
         <w:rPr>
           <w:b/>
           <w:bCs/>
+          <w:sz w:val="32"/>
+          <w:szCs w:val="32"/>
         </w:rPr>
       </w:pPr>
       <w:r>
         <w:rPr>
           <w:b/>
           <w:bCs/>
+          <w:sz w:val="32"/>
+          <w:szCs w:val="32"/>
         </w:rPr>
         <w:t>13. Raporty z testów</w:t>
       </w:r>
@@ -1796,12 +1886,16 @@
         <w:rPr>
           <w:b/>
           <w:bCs/>
+          <w:sz w:val="32"/>
+          <w:szCs w:val="32"/>
         </w:rPr>
       </w:pPr>
       <w:r>
         <w:rPr>
           <w:b/>
           <w:bCs/>
+          <w:sz w:val="32"/>
+          <w:szCs w:val="32"/>
         </w:rPr>
         <w:t>14. Lista narzędzi</w:t>
       </w:r>
@@ -1862,6 +1956,7 @@
         </w:numPr>
       </w:pPr>
       <w:r>
+        <w:lastRenderedPageBreak/>
         <w:t xml:space="preserve">Docker </w:t>
       </w:r>
     </w:p>
@@ -1895,7 +1990,6 @@
         </w:numPr>
       </w:pPr>
       <w:r>
-        <w:lastRenderedPageBreak/>
         <w:t xml:space="preserve">GitHub </w:t>
       </w:r>
       <w:proofErr w:type="spellStart"/>
@@ -1954,12 +2048,16 @@
         <w:rPr>
           <w:b/>
           <w:bCs/>
+          <w:sz w:val="32"/>
+          <w:szCs w:val="32"/>
         </w:rPr>
       </w:pPr>
       <w:r>
         <w:rPr>
           <w:b/>
           <w:bCs/>
+          <w:sz w:val="32"/>
+          <w:szCs w:val="32"/>
         </w:rPr>
         <w:t>15. Zarządzanie incydentami</w:t>
       </w:r>
@@ -2150,11 +2248,20 @@
           <w:bCs/>
         </w:rPr>
       </w:pPr>
-      <w:r>
+    </w:p>
+    <w:p>
+      <w:pPr>
         <w:rPr>
           <w:b/>
           <w:bCs/>
         </w:rPr>
+      </w:pPr>
+      <w:r>
+        <w:rPr>
+          <w:b/>
+          <w:bCs/>
+        </w:rPr>
+        <w:lastRenderedPageBreak/>
         <w:t>16. Role i odpowiedzialność</w:t>
       </w:r>
     </w:p>
@@ -2206,7 +2313,6 @@
         </w:numPr>
       </w:pPr>
       <w:r>
-        <w:lastRenderedPageBreak/>
         <w:t xml:space="preserve">implementację testów, </w:t>
       </w:r>
     </w:p>

</xml_diff>